<commit_message>
Elimina opción Ejercicios del desplegable de PDF Gratis en el nav
Co-Authored-By: Claude Sonnet 4.6 <noreply@anthropic.com>
</commit_message>
<xml_diff>
--- a/DESCARGABLES_PDF/VER_MIRAR/VER_MIRAR.docx
+++ b/DESCARGABLES_PDF/VER_MIRAR/VER_MIRAR.docx
@@ -4,7 +4,7 @@
   <w:body>
     <w:tbl>
       <w:tblPr>
-        <w:tblW w:w="19736" w:type="dxa"/>
+        <w:tblW w:w="9910" w:type="dxa"/>
         <w:tblBorders>
           <w:top w:val="single" w:sz="4" w:space="0" w:color="auto"/>
           <w:left w:val="single" w:sz="4" w:space="0" w:color="auto"/>
@@ -20,102 +20,20 @@
         <w:tblLook w:val="04A0" w:firstRow="1" w:lastRow="0" w:firstColumn="1" w:lastColumn="0" w:noHBand="0" w:noVBand="1"/>
       </w:tblPr>
       <w:tblGrid>
-        <w:gridCol w:w="9868"/>
-        <w:gridCol w:w="9868"/>
+        <w:gridCol w:w="9910"/>
       </w:tblGrid>
       <w:tr>
-        <w:tc>
-          <w:tcPr>
-            <w:tcW w:w="9868" w:type="dxa"/>
-            <w:tcBorders>
-              <w:top w:val="none" w:sz="0" w:space="0" w:color="FFFFFF"/>
-              <w:left w:val="none" w:sz="0" w:space="0" w:color="FFFFFF"/>
-              <w:bottom w:val="none" w:sz="0" w:space="0" w:color="FFFFFF"/>
-              <w:right w:val="none" w:sz="0" w:space="0" w:color="FFFFFF"/>
-            </w:tcBorders>
-            <w:shd w:val="clear" w:color="auto" w:fill="7B1D1D"/>
-          </w:tcPr>
-          <w:p>
-            <w:pPr>
-              <w:spacing w:after="80"/>
-              <w:jc w:val="center"/>
-              <w:rPr>
-                <w:lang w:val="en-GB"/>
-              </w:rPr>
-            </w:pPr>
-            <w:r>
-              <w:rPr>
-                <w:rFonts w:ascii="Arial" w:eastAsia="Arial" w:hAnsi="Arial" w:cs="Arial"/>
-                <w:b/>
-                <w:bCs/>
-                <w:color w:val="FFFFFF"/>
-                <w:sz w:val="17"/>
-                <w:szCs w:val="17"/>
-                <w:lang w:val="en-GB"/>
-              </w:rPr>
-              <w:t>SPANISH LESSONS — with Mercedes</w:t>
-            </w:r>
-          </w:p>
-          <w:p>
-            <w:pPr>
-              <w:shd w:val="clear" w:color="auto" w:fill="7B1A1A"/>
-              <w:spacing w:before="80"/>
-              <w:jc w:val="center"/>
-              <w:rPr>
-                <w:lang w:val="en-GB"/>
-              </w:rPr>
-            </w:pPr>
-            <w:r>
-              <w:rPr>
-                <w:rFonts w:ascii="Arial" w:eastAsia="Arial" w:hAnsi="Arial" w:cs="Arial"/>
-                <w:b/>
-                <w:bCs/>
-                <w:color w:val="F5C518"/>
-                <w:sz w:val="44"/>
-                <w:szCs w:val="44"/>
-                <w:lang w:val="en-GB"/>
-              </w:rPr>
-              <w:t>VER · MIRAR · OBSERVAR</w:t>
-            </w:r>
-          </w:p>
-          <w:p>
-            <w:pPr>
-              <w:shd w:val="clear" w:color="auto" w:fill="7B1A1A"/>
-              <w:jc w:val="center"/>
-            </w:pPr>
-            <w:r>
-              <w:rPr>
-                <w:rFonts w:ascii="Arial" w:eastAsia="Arial" w:hAnsi="Arial" w:cs="Arial"/>
-                <w:color w:val="DDDDDD"/>
-                <w:sz w:val="24"/>
-                <w:szCs w:val="24"/>
-              </w:rPr>
-              <w:t xml:space="preserve">¿Dices "miro la televisión"? </w:t>
-            </w:r>
-          </w:p>
-          <w:p>
-            <w:pPr>
-              <w:spacing w:after="80"/>
-              <w:jc w:val="center"/>
-              <w:rPr>
-                <w:rFonts w:ascii="Arial" w:eastAsia="Arial" w:hAnsi="Arial" w:cs="Arial"/>
-                <w:b/>
-                <w:bCs/>
-                <w:color w:val="FFFFFF"/>
-                <w:sz w:val="17"/>
-                <w:szCs w:val="17"/>
-              </w:rPr>
-            </w:pPr>
-          </w:p>
-        </w:tc>
-        <w:tc>
-          <w:tcPr>
-            <w:tcW w:w="9868" w:type="dxa"/>
-            <w:tcBorders>
-              <w:top w:val="none" w:sz="0" w:space="0" w:color="FFFFFF"/>
-              <w:left w:val="none" w:sz="0" w:space="0" w:color="FFFFFF"/>
-              <w:bottom w:val="none" w:sz="0" w:space="0" w:color="FFFFFF"/>
-              <w:right w:val="none" w:sz="0" w:space="0" w:color="FFFFFF"/>
+        <w:trPr>
+          <w:trHeight w:val="2124"/>
+        </w:trPr>
+        <w:tc>
+          <w:tcPr>
+            <w:tcW w:w="9910" w:type="dxa"/>
+            <w:tcBorders>
+              <w:top w:val="nil"/>
+              <w:left w:val="nil"/>
+              <w:bottom w:val="single" w:sz="4" w:space="0" w:color="auto"/>
+              <w:right w:val="nil"/>
             </w:tcBorders>
             <w:shd w:val="clear" w:color="auto" w:fill="7B1D1D"/>
             <w:tcMar>
@@ -127,6 +45,16 @@
           </w:tcPr>
           <w:p>
             <w:pPr>
+              <w:jc w:val="center"/>
+            </w:pPr>
+          </w:p>
+          <w:p>
+            <w:pPr>
+              <w:jc w:val="center"/>
+            </w:pPr>
+          </w:p>
+          <w:p>
+            <w:pPr>
               <w:spacing w:after="80"/>
               <w:jc w:val="center"/>
             </w:pPr>
@@ -156,7 +84,7 @@
                 <w:sz w:val="72"/>
                 <w:szCs w:val="72"/>
               </w:rPr>
-              <w:t>SER y ESTAR en español</w:t>
+              <w:t>VER-MIRAR-OBSERVAR</w:t>
             </w:r>
           </w:p>
           <w:p>
@@ -170,8 +98,40 @@
                 <w:sz w:val="22"/>
                 <w:szCs w:val="22"/>
               </w:rPr>
-              <w:t>Los dos verbos que todo el mundo confunde  ·  Nivel A1 – B1</w:t>
-            </w:r>
+              <w:t>Diferencias de significado entre los tres verbos</w:t>
+            </w:r>
+            <w:r>
+              <w:rPr>
+                <w:rFonts w:ascii="Calibri" w:eastAsia="Calibri" w:hAnsi="Calibri" w:cs="Calibri"/>
+                <w:color w:val="DDDDDD"/>
+                <w:sz w:val="22"/>
+                <w:szCs w:val="22"/>
+              </w:rPr>
+              <w:t xml:space="preserve">  ·  Nivel </w:t>
+            </w:r>
+            <w:r>
+              <w:rPr>
+                <w:rFonts w:ascii="Calibri" w:eastAsia="Calibri" w:hAnsi="Calibri" w:cs="Calibri"/>
+                <w:color w:val="DDDDDD"/>
+                <w:sz w:val="22"/>
+                <w:szCs w:val="22"/>
+              </w:rPr>
+              <w:t>B</w:t>
+            </w:r>
+            <w:r>
+              <w:rPr>
+                <w:rFonts w:ascii="Calibri" w:eastAsia="Calibri" w:hAnsi="Calibri" w:cs="Calibri"/>
+                <w:color w:val="DDDDDD"/>
+                <w:sz w:val="22"/>
+                <w:szCs w:val="22"/>
+              </w:rPr>
+              <w:t xml:space="preserve">1 – </w:t>
+            </w:r>
+          </w:p>
+          <w:p>
+            <w:pPr>
+              <w:jc w:val="center"/>
+            </w:pPr>
           </w:p>
         </w:tc>
       </w:tr>
@@ -1375,6 +1335,9 @@
               <w:pBdr>
                 <w:bottom w:val="single" w:sz="8" w:space="4" w:color="B22222"/>
               </w:pBdr>
+              <w:tabs>
+                <w:tab w:val="right" w:pos="9427"/>
+              </w:tabs>
               <w:spacing w:before="280" w:after="140"/>
               <w:rPr>
                 <w:color w:val="FFFFFF" w:themeColor="background1"/>
@@ -1412,6 +1375,17 @@
                 <w:szCs w:val="26"/>
               </w:rPr>
               <w:t>R</w:t>
+            </w:r>
+            <w:r>
+              <w:rPr>
+                <w:rFonts w:ascii="Arial" w:eastAsia="Arial" w:hAnsi="Arial" w:cs="Arial"/>
+                <w:b/>
+                <w:bCs/>
+                <w:color w:val="FFFFFF" w:themeColor="background1"/>
+                <w:sz w:val="26"/>
+                <w:szCs w:val="26"/>
+              </w:rPr>
+              <w:tab/>
             </w:r>
           </w:p>
         </w:tc>
@@ -2206,7 +2180,7 @@
                     <pic:cNvPicPr/>
                   </pic:nvPicPr>
                   <pic:blipFill>
-                    <a:blip r:embed="rId7" cstate="print">
+                    <a:blip r:embed="rId8" cstate="print">
                       <a:extLst>
                         <a:ext uri="{28A0092B-C50C-407E-A947-70E740481C1C}">
                           <a14:useLocalDpi xmlns:a14="http://schemas.microsoft.com/office/drawing/2010/main" val="0"/>
@@ -3028,7 +3002,7 @@
                     <pic:cNvPicPr/>
                   </pic:nvPicPr>
                   <pic:blipFill>
-                    <a:blip r:embed="rId8" cstate="print">
+                    <a:blip r:embed="rId9" cstate="print">
                       <a:extLst>
                         <a:ext uri="{28A0092B-C50C-407E-A947-70E740481C1C}">
                           <a14:useLocalDpi xmlns:a14="http://schemas.microsoft.com/office/drawing/2010/main" val="0"/>
@@ -4133,7 +4107,7 @@
                 <w:color w:val="DDDDDD"/>
                 <w:lang w:val="en-GB"/>
               </w:rPr>
-              <w:t>EN: Today I'm not watching TV, I'm very tired.</w:t>
+              <w:t>Today I'm not watching TV, I'm very tired.</w:t>
             </w:r>
           </w:p>
         </w:tc>
@@ -8199,8 +8173,8 @@
     </w:p>
     <w:p/>
     <w:sectPr>
-      <w:headerReference w:type="default" r:id="rId9"/>
-      <w:footerReference w:type="default" r:id="rId10"/>
+      <w:headerReference w:type="default" r:id="rId10"/>
+      <w:footerReference w:type="default" r:id="rId11"/>
       <w:pgSz w:w="11906" w:h="16838"/>
       <w:pgMar w:top="1700" w:right="1019" w:bottom="1019" w:left="1019" w:header="708" w:footer="708" w:gutter="0"/>
       <w:cols w:space="720"/>
@@ -8282,16 +8256,6 @@
         <w:lang w:val="en-GB"/>
       </w:rPr>
     </w:pPr>
-    <w:r>
-      <w:rPr>
-        <w:rFonts w:ascii="Arial" w:eastAsia="Arial" w:hAnsi="Arial" w:cs="Arial"/>
-        <w:b/>
-        <w:bCs/>
-        <w:color w:val="1B2A4A"/>
-        <w:lang w:val="en-GB"/>
-      </w:rPr>
-      <w:ptab w:relativeTo="margin" w:alignment="center" w:leader="none"/>
-    </w:r>
     <w:r>
       <w:rPr>
         <w:noProof/>
@@ -8377,7 +8341,7 @@
         <w:color w:val="1B2A4A"/>
         <w:lang w:val="en-GB"/>
       </w:rPr>
-      <w:t xml:space="preserve"> </w:t>
+      <w:t xml:space="preserve">              </w:t>
     </w:r>
     <w:r>
       <w:rPr>
@@ -8387,13 +8351,25 @@
         <w:color w:val="1B2A4A"/>
         <w:lang w:val="en-GB"/>
       </w:rPr>
-      <w:t>SPANISH LESSONS  with Mercedes</w:t>
+      <w:t xml:space="preserve"> SPANISH LESSONS  with Mercedes</w:t>
     </w:r>
     <w:r>
       <w:rPr>
         <w:lang w:val="en-GB"/>
       </w:rPr>
       <w:tab/>
+    </w:r>
+    <w:r>
+      <w:rPr>
+        <w:lang w:val="en-GB"/>
+      </w:rPr>
+      <w:t>sp</w:t>
+    </w:r>
+    <w:r>
+      <w:rPr>
+        <w:lang w:val="en-GB"/>
+      </w:rPr>
+      <w:t>anishlessonswithmercedes@gmail.com</w:t>
     </w:r>
   </w:p>
   <w:p>
@@ -8414,19 +8390,9 @@
         <w:color w:val="2C2C2C"/>
         <w:sz w:val="17"/>
         <w:szCs w:val="17"/>
+        <w:lang w:val="en-GB"/>
       </w:rPr>
-      <w:t xml:space="preserve">     </w:t>
-    </w:r>
-    <w:r>
-      <w:rPr>
-        <w:rFonts w:ascii="Arial" w:eastAsia="Arial" w:hAnsi="Arial" w:cs="Arial"/>
-        <w:i/>
-        <w:iCs/>
-        <w:color w:val="2C2C2C"/>
-        <w:sz w:val="17"/>
-        <w:szCs w:val="17"/>
-      </w:rPr>
-      <w:t xml:space="preserve">                                         </w:t>
+      <w:t xml:space="preserve">                 </w:t>
     </w:r>
     <w:r>
       <w:rPr>
@@ -9229,6 +9195,18 @@
     <w:uiPriority w:val="99"/>
     <w:rsid w:val="007C22AF"/>
   </w:style>
+  <w:style w:type="character" w:styleId="Mencinsinresolver">
+    <w:name w:val="Unresolved Mention"/>
+    <w:basedOn w:val="Fuentedeprrafopredeter"/>
+    <w:uiPriority w:val="99"/>
+    <w:semiHidden/>
+    <w:unhideWhenUsed/>
+    <w:rsid w:val="00B57704"/>
+    <w:rPr>
+      <w:color w:val="605E5C"/>
+      <w:shd w:val="clear" w:color="auto" w:fill="E1DFDD"/>
+    </w:rPr>
+  </w:style>
 </w:styles>
 </file>
 
@@ -9545,4 +9523,16 @@
     </a:ext>
   </a:extLst>
 </a:theme>
+</file>
+
+<file path=customXml/item1.xml><?xml version="1.0" encoding="utf-8"?>
+<b:Sources xmlns:b="http://schemas.openxmlformats.org/officeDocument/2006/bibliography" xmlns="http://schemas.openxmlformats.org/officeDocument/2006/bibliography" SelectedStyle="\APASixthEditionOfficeOnline.xsl" StyleName="APA" Version="6"/>
+</file>
+
+<file path=customXml/itemProps1.xml><?xml version="1.0" encoding="utf-8"?>
+<ds:datastoreItem xmlns:ds="http://schemas.openxmlformats.org/officeDocument/2006/customXml" ds:itemID="{4E749813-9157-4A09-865E-16519DD24720}">
+  <ds:schemaRefs>
+    <ds:schemaRef ds:uri="http://schemas.openxmlformats.org/officeDocument/2006/bibliography"/>
+  </ds:schemaRefs>
+</ds:datastoreItem>
 </file>
</xml_diff>